<commit_message>
Align the memo and charts with the calculated figures.
One command rewrites REPORT.md and the four screenshots. The README
and Word note use the same PD, exposure, earnings-stress, and
illustrative loss figures, and GitHub Actions runs the pinned tests.

Co-authored-by: Par Bahrae <githubproproject@proton.me>
</commit_message>
<xml_diff>
--- a/Risk_Assessment_Report.docx
+++ b/Risk_Assessment_Report.docx
@@ -315,35 +315,35 @@
       </w:pPr>
       <w:r>
         <w:rPr/>
-        <w:t>Overall portfolio default probability averages 29.80%</w:t>
-      </w:r>
-    </w:p>
-    <w:p>
-      <w:pPr>
-        <w:pStyle w:val="ListParagraph"/>
-        <w:numPr>
-          <w:ilvl w:val="0"/>
-          <w:numId w:val="1"/>
-        </w:numPr>
-        <w:rPr/>
-      </w:pPr>
-      <w:r>
-        <w:rPr/>
-        <w:t>Estimated VaR at 95% confidence: $43,146.55</w:t>
-      </w:r>
-    </w:p>
-    <w:p>
-      <w:pPr>
-        <w:pStyle w:val="ListParagraph"/>
-        <w:numPr>
-          <w:ilvl w:val="0"/>
-          <w:numId w:val="1"/>
-        </w:numPr>
-        <w:rPr/>
-      </w:pPr>
-      <w:r>
-        <w:rPr/>
-        <w:t>High-risk operational areas identified: 504 loans with PD &gt; 20% (50.4% of portfolio)</w:t>
+        <w:t>Unweighted mean account PD is 29.80%; EAD-weighted PD is 17.23%</w:t>
+      </w:r>
+    </w:p>
+    <w:p>
+      <w:pPr>
+        <w:pStyle w:val="ListParagraph"/>
+        <w:numPr>
+          <w:ilvl w:val="0"/>
+          <w:numId w:val="1"/>
+        </w:numPr>
+        <w:rPr/>
+      </w:pPr>
+      <w:r>
+        <w:rPr/>
+        <w:t>Illustrative 95% credit-loss VaR is $9,526,628.91 (assumed LGD 45%, correlation 0.15)</w:t>
+      </w:r>
+    </w:p>
+    <w:p>
+      <w:pPr>
+        <w:pStyle w:val="ListParagraph"/>
+        <w:numPr>
+          <w:ilvl w:val="0"/>
+          <w:numId w:val="1"/>
+        </w:numPr>
+        <w:rPr/>
+      </w:pPr>
+      <w:r>
+        <w:rPr/>
+        <w:t>504 loans have PD above 20% (50.4% of count, 29.72% of EAD)</w:t>
       </w:r>
     </w:p>
     <w:p>
@@ -358,7 +358,7 @@
       </w:pPr>
       <w:r>
         <w:rPr/>
-        <w:t>Combined stress scenario shows potential loss of $12,559,240.00</w:t>
+        <w:t>Combined borrower-earnings stress: aggregate net income -$12,559,240.00, which is not credit loss</w:t>
       </w:r>
     </w:p>
     <w:p>
@@ -417,7 +417,7 @@
       </w:pPr>
       <w:r>
         <w:rPr/>
-        <w:t>Credit Score (range: 300-850)</w:t>
+        <w:t>Credit Score (observed 421 to 850)</w:t>
       </w:r>
     </w:p>
     <w:p>
@@ -505,7 +505,7 @@
       </w:r>
       <w:r>
         <w:rPr/>
-        <w:t>Calculated using logistic regression on Credit Score, Loan Amount, and Operational Risk Score</w:t>
+        <w:t>in-sample logistic regression on credit score, loan amount, and operational risk. LGD is not observed; illustrative loss uses a constant 45% LGD. EAD is loan amount. EL = PD × LGD × EAD.</w:t>
       </w:r>
     </w:p>
     <w:p>
@@ -526,7 +526,7 @@
       </w:r>
       <w:r>
         <w:rPr/>
-        <w:t>Computed at 95% and 99% confidence levels for Net Income under stress scenarios</w:t>
+        <w:t>Credit-loss VaR is a quantile of simulated portfolio loss. Borrower-income percentiles are reported separately and are not VaR.</w:t>
       </w:r>
     </w:p>
     <w:p>
@@ -548,7 +548,7 @@
       </w:r>
       <w:r>
         <w:rPr/>
-        <w:t>Included 20% revenue drop and 10% expense increase scenarios</w:t>
+        <w:t>a 20% revenue drop and a 10% expense increase. This does not change PD or expected loss. Credit stress: systematic factor at its 5th percentile.</w:t>
       </w:r>
     </w:p>
     <w:p>
@@ -666,21 +666,21 @@
       </w:pPr>
       <w:r>
         <w:rPr/>
-        <w:t>The average probability of default across the portfolio is 29.80%, indicating significant credit risk exposure. The distribution analysis reveals:</w:t>
-      </w:r>
-    </w:p>
-    <w:p>
-      <w:pPr>
-        <w:pStyle w:val="ListParagraph"/>
-        <w:numPr>
-          <w:ilvl w:val="0"/>
-          <w:numId w:val="1"/>
-        </w:numPr>
-        <w:rPr/>
-      </w:pPr>
-      <w:r>
-        <w:rPr/>
-        <w:t>504 loans (50.4%) have PD &gt; 20%</w:t>
+        <w:t>The unweighted mean of in-sample account PDs is 29.80%. The EAD-weighted mean is 17.23% because higher-PD loans are smaller. These PDs are the full-sample logistic fit, not a holdout validation.</w:t>
+      </w:r>
+    </w:p>
+    <w:p>
+      <w:pPr>
+        <w:pStyle w:val="ListParagraph"/>
+        <w:numPr>
+          <w:ilvl w:val="0"/>
+          <w:numId w:val="1"/>
+        </w:numPr>
+        <w:rPr/>
+      </w:pPr>
+      <w:r>
+        <w:rPr/>
+        <w:t>504 loans have PD above 20% (50.4% of count and 29.72% of EAD)</w:t>
       </w:r>
     </w:p>
     <w:p>
@@ -709,7 +709,7 @@
       </w:pPr>
       <w:r>
         <w:rPr/>
-        <w:t>Operational risk score acts as a multiplier on baseline default risk</w:t>
+        <w:t>Operational risk score is barely associated with default (correlation 0.02)</w:t>
       </w:r>
     </w:p>
     <w:p>
@@ -854,24 +854,24 @@
       </w:pPr>
       <w:r>
         <w:rPr/>
-        <w:t>VaR analysis provides insights into potential losses under adverse market conditions:</w:t>
-      </w:r>
-    </w:p>
-    <w:p>
-      <w:pPr>
-        <w:pStyle w:val="ListParagraph"/>
-        <w:numPr>
-          <w:ilvl w:val="0"/>
-          <w:numId w:val="1"/>
-        </w:numPr>
-        <w:rPr/>
-      </w:pPr>
-      <w:r>
-        <w:rPr>
-          <w:b/>
-          <w:bCs/>
-        </w:rPr>
-        <w:t xml:space="preserve">VaR (95% confidence): </w:t>
+        <w:t>The next two figures are percentiles of borrower net income per account. They were mislabeled as VaR in the February 2023 draft. A loss VaR cannot be smaller at 99% than at 95%.</w:t>
+      </w:r>
+    </w:p>
+    <w:p>
+      <w:pPr>
+        <w:pStyle w:val="ListParagraph"/>
+        <w:numPr>
+          <w:ilvl w:val="0"/>
+          <w:numId w:val="1"/>
+        </w:numPr>
+        <w:rPr/>
+      </w:pPr>
+      <w:r>
+        <w:rPr>
+          <w:b/>
+          <w:bCs/>
+        </w:rPr>
+        <w:t xml:space="preserve">5th percentile of borrower net income: </w:t>
       </w:r>
       <w:r>
         <w:rPr/>
@@ -893,7 +893,7 @@
           <w:b/>
           <w:bCs/>
         </w:rPr>
-        <w:t xml:space="preserve">VaR (99% confidence): </w:t>
+        <w:t xml:space="preserve">1st percentile of borrower net income: </w:t>
       </w:r>
       <w:r>
         <w:rPr/>
@@ -915,7 +915,7 @@
       </w:r>
       <w:r>
         <w:rPr/>
-        <w:t>In 5% of worst-case scenarios, the portfolio could experience net income below $43,147 per customer, representing significant tail risk exposure.</w:t>
+        <w:t>Those income percentiles are dollars per borrower, not a portfolio credit loss. Under an assumed LGD of 45% and an asset correlation of 0.15 (20,000 draws, seed 42), illustrative portfolio credit-loss VaR is $9,526,628.91 at 95% and $11,936,201.30 at 99%. Expected loss on that assumption is $5,280,499.32. LGD and correlation are not estimated from this file.</w:t>
       </w:r>
     </w:p>
     <w:p>
@@ -1020,7 +1020,7 @@
                 <w:bCs/>
                 <w:color w:val="FFFFFF"/>
               </w:rPr>
-              <w:t>Total Net Income</w:t>
+              <w:t>Aggregate borrower net income</w:t>
             </w:r>
           </w:p>
         </w:tc>
@@ -1093,7 +1093,7 @@
             </w:pPr>
             <w:r>
               <w:rPr/>
-              <w:t>$124,207,710.74</w:t>
+              <w:t>$124,207,710.82</w:t>
             </w:r>
           </w:p>
         </w:tc>
@@ -1115,7 +1115,7 @@
             </w:pPr>
             <w:r>
               <w:rPr/>
-              <w:t>Normal operating conditions</w:t>
+              <w:t>Revenue minus expenses. The Net_Income column sums to $124,207,710.74 ($0.08 rounding gap).</w:t>
             </w:r>
           </w:p>
         </w:tc>
@@ -1181,7 +1181,7 @@
             </w:pPr>
             <w:r>
               <w:rPr/>
-              <w:t>Significant exposure in consumer lending segment; 80% reduction in profitability</w:t>
+              <w:t>Aggregate borrower net income falls 80.07%. The file has no segment column.</w:t>
             </w:r>
           </w:p>
         </w:tc>
@@ -1250,7 +1250,7 @@
             </w:pPr>
             <w:r>
               <w:rPr/>
-              <w:t>Operational inefficiencies identified; 30% profit erosion</w:t>
+              <w:t>Aggregate borrower net income falls 30.04%. This is not lender profit.</w:t>
             </w:r>
           </w:p>
         </w:tc>
@@ -1328,7 +1328,7 @@
                 <w:b/>
                 <w:bCs/>
               </w:rPr>
-              <w:t>Severe market downturn; portfolio becomes unprofitable</w:t>
+              <w:t>Aggregate borrower net income is negative. This is not expected credit loss.</w:t>
             </w:r>
           </w:p>
         </w:tc>
@@ -1424,7 +1424,7 @@
       </w:pPr>
       <w:r>
         <w:rPr/>
-        <w:t>Analysis of operational risk scores reveals critical vulnerabilities:</w:t>
+        <w:t>Operational risk scores on this book:</w:t>
       </w:r>
     </w:p>
     <w:p>
@@ -1445,7 +1445,7 @@
       </w:r>
       <w:r>
         <w:rPr/>
-        <w:t>Customers with operational risk scores above 60 show 2.5x higher default rates</w:t>
+        <w:t>Customers with operational risk above 60 default at 29.67% (27 of 91), versus 29.81% (271 of 909) for the rest</w:t>
       </w:r>
     </w:p>
     <w:p>
@@ -1466,7 +1466,7 @@
       </w:r>
       <w:r>
         <w:rPr/>
-        <w:t>Operational risks compound credit risks, especially in low credit score segments</w:t>
+        <w:t>This file does not show a higher default rate when the operational risk score is already high</w:t>
       </w:r>
     </w:p>
     <w:p>
@@ -1502,7 +1502,7 @@
           <w:b/>
           <w:bCs/>
         </w:rPr>
-        <w:t>Figure 4: Operational Risk Score Distribution</w:t>
+        <w:t>Figure 4: High-PD concentration and operational-risk default rates</w:t>
       </w:r>
     </w:p>
     <w:p>
@@ -1648,7 +1648,7 @@
       </w:r>
       <w:r>
         <w:rPr/>
-        <w:t>Establish enhanced process monitoring for accounts with operational risk scores above 60. Implement automated alerts and quarterly reviews. Invest in process optimization initiatives to reduce operational inefficiencies.</w:t>
+        <w:t>Do not treat an operational risk score above 60 as a default screen on this book: that band's default rate matches the rest. Monitoring can still be an operational control.</w:t>
       </w:r>
     </w:p>
     <w:p>
@@ -1680,7 +1680,7 @@
       </w:r>
       <w:r>
         <w:rPr/>
-        <w:t>Develop comprehensive contingency plans for revenue drops and cost spikes. Establish buffer capital equivalent to at least 15% of total loan portfolio ($10.2M) to withstand combined stress scenarios. Create rapid response protocols for market downturns.</w:t>
+        <w:t>Size any capital buffer from credit-loss expected loss and VaR. Those figures depend on an LGD and a correlation this file does not contain. Do not size the buffer from the borrower-income stress.</w:t>
       </w:r>
     </w:p>
     <w:p>
@@ -1712,7 +1712,7 @@
       </w:r>
       <w:r>
         <w:rPr/>
-        <w:t>Reduce concentration in high-risk segments (currently 50.4% of portfolio). Target a more balanced distribution with no more than 30% of loans in the high-risk category. Explore opportunities in lower-risk, stable-income customer segments.</w:t>
+        <w:t>High-PD loans are 50.4% of count and 29.72% of EAD. Exposure concentration is the figure to manage. A 30% cap would be a policy choice, not a result from this file.</w:t>
       </w:r>
     </w:p>
     <w:p>
@@ -1839,7 +1839,7 @@
       </w:pPr>
       <w:r>
         <w:rPr/>
-        <w:t>Clear correlation between operational risk and credit default probability</w:t>
+        <w:t>Credit score, not operational risk, is the variable associated with default</w:t>
       </w:r>
     </w:p>
     <w:p>
@@ -1865,7 +1865,7 @@
       </w:pPr>
       <w:r>
         <w:rPr/>
-        <w:t>The methodologies applied — logistic regression for PD modeling, percentile-based VaR calculation, and scenario-based stress testing — represent industry-standard approaches to enterprise risk management. The insights generated provide a solid foundation for informed capital allocation, portfolio optimization, and strategic planning.</w:t>
+        <w:t>The PD model is an in-sample logistic regression. Credit-loss VaR here is a simulated loss quantile under stated assumptions, not a Basel capital number. Borrower earnings stress is reported separately from expected loss.</w:t>
       </w:r>
     </w:p>
     <w:p>
@@ -1876,7 +1876,7 @@
       </w:pPr>
       <w:r>
         <w:rPr/>
-        <w:t>Implementation of the recommended risk mitigation strategies is expected to reduce portfolio PD by 8-12 percentage points, improve stress test outcomes by 20-25%, and enhance overall risk-adjusted returns. Continued monitoring and iterative refinement of risk models will be essential to maintaining portfolio health in dynamic market conditions.</w:t>
+        <w:t>The draft assigned the recommendations a PD reduction and a stress improvement. Those effects were not estimated, and they are not reported here.</w:t>
       </w:r>
     </w:p>
     <w:p>
@@ -1956,7 +1956,7 @@
       </w:pPr>
       <w:r>
         <w:rPr/>
-        <w:t>Where the model captures the non-linear relationship between credit quality and default risk, with operational risk acting as a multiplier effect.</w:t>
+        <w:t>The published PD is the in-sample fit. Operational risk is not a multiplier on this book. Out-of-fold AUC is 0.852. Loan amount is collinear with credit score (correlation 0.92); its positive coefficient is not a standalone size effect.</w:t>
       </w:r>
     </w:p>
     <w:p>
@@ -2065,7 +2065,7 @@
       </w:pPr>
       <w:r>
         <w:rPr/>
-        <w:t>Net Portfolio Income: $124,207,710.74</w:t>
+        <w:t>Sum of the Net_Income column: $124,207,710.74. Revenue minus expenses is $124,207,710.82.</w:t>
       </w:r>
     </w:p>
     <w:p>
@@ -2086,7 +2086,7 @@
       </w:pPr>
       <w:r>
         <w:rPr/>
-        <w:t>All analytical methods employed in this report follow industry best practices:</w:t>
+        <w:t>Notes on the methods:</w:t>
       </w:r>
     </w:p>
     <w:p>
@@ -2128,7 +2128,7 @@
       </w:r>
       <w:r>
         <w:rPr/>
-        <w:t>Standard metric prescribed by Basel III regulatory framework</w:t>
+        <w:t>a loss quantile. The illustrative figure is not regulatory capital.</w:t>
       </w:r>
     </w:p>
     <w:p>
@@ -2149,7 +2149,7 @@
       </w:r>
       <w:r>
         <w:rPr/>
-        <w:t>Aligns with Federal Reserve CCAR (Comprehensive Capital Analysis and Review) guidelines</w:t>
+        <w:t>borrower earnings shocks are separate from credit-loss shocks. This is not a CCAR submission.</w:t>
       </w:r>
     </w:p>
     <w:p>

</xml_diff>

<commit_message>
Correct credit-loss definitions and make the case study reproducible (#5)
* Define PD, LGD, EAD, and a seeded book.

Expected loss is PD times an explicit LGD times loan-amount EAD.
Borrower earnings shocks stay in net-income units, and the income
percentiles previously labeled VaR are no longer treated as a loss
quantile. Tests pin those figures on the checked-in portfolio.

Co-authored-by: Par Bahrae <githubproproject@proton.me>

* Align the memo and charts with the calculated figures.

One command rewrites REPORT.md and the four screenshots. The README
and Word note use the same PD, exposure, earnings-stress, and
illustrative loss figures, and GitHub Actions runs the pinned tests.

Co-authored-by: Par Bahrae <githubproproject@proton.me>

---------

Co-authored-by: Cursor Agent <cursoragent@cursor.com>
</commit_message>
<xml_diff>
--- a/Risk_Assessment_Report.docx
+++ b/Risk_Assessment_Report.docx
@@ -315,35 +315,35 @@
       </w:pPr>
       <w:r>
         <w:rPr/>
-        <w:t>Overall portfolio default probability averages 29.80%</w:t>
-      </w:r>
-    </w:p>
-    <w:p>
-      <w:pPr>
-        <w:pStyle w:val="ListParagraph"/>
-        <w:numPr>
-          <w:ilvl w:val="0"/>
-          <w:numId w:val="1"/>
-        </w:numPr>
-        <w:rPr/>
-      </w:pPr>
-      <w:r>
-        <w:rPr/>
-        <w:t>Estimated VaR at 95% confidence: $43,146.55</w:t>
-      </w:r>
-    </w:p>
-    <w:p>
-      <w:pPr>
-        <w:pStyle w:val="ListParagraph"/>
-        <w:numPr>
-          <w:ilvl w:val="0"/>
-          <w:numId w:val="1"/>
-        </w:numPr>
-        <w:rPr/>
-      </w:pPr>
-      <w:r>
-        <w:rPr/>
-        <w:t>High-risk operational areas identified: 504 loans with PD &gt; 20% (50.4% of portfolio)</w:t>
+        <w:t>Unweighted mean account PD is 29.80%; EAD-weighted PD is 17.23%</w:t>
+      </w:r>
+    </w:p>
+    <w:p>
+      <w:pPr>
+        <w:pStyle w:val="ListParagraph"/>
+        <w:numPr>
+          <w:ilvl w:val="0"/>
+          <w:numId w:val="1"/>
+        </w:numPr>
+        <w:rPr/>
+      </w:pPr>
+      <w:r>
+        <w:rPr/>
+        <w:t>Illustrative 95% credit-loss VaR is $9,526,628.91 (assumed LGD 45%, correlation 0.15)</w:t>
+      </w:r>
+    </w:p>
+    <w:p>
+      <w:pPr>
+        <w:pStyle w:val="ListParagraph"/>
+        <w:numPr>
+          <w:ilvl w:val="0"/>
+          <w:numId w:val="1"/>
+        </w:numPr>
+        <w:rPr/>
+      </w:pPr>
+      <w:r>
+        <w:rPr/>
+        <w:t>504 loans have PD above 20% (50.4% of count, 29.72% of EAD)</w:t>
       </w:r>
     </w:p>
     <w:p>
@@ -358,7 +358,7 @@
       </w:pPr>
       <w:r>
         <w:rPr/>
-        <w:t>Combined stress scenario shows potential loss of $12,559,240.00</w:t>
+        <w:t>Combined borrower-earnings stress: aggregate net income -$12,559,240.00, which is not credit loss</w:t>
       </w:r>
     </w:p>
     <w:p>
@@ -417,7 +417,7 @@
       </w:pPr>
       <w:r>
         <w:rPr/>
-        <w:t>Credit Score (range: 300-850)</w:t>
+        <w:t>Credit Score (observed 421 to 850)</w:t>
       </w:r>
     </w:p>
     <w:p>
@@ -505,7 +505,7 @@
       </w:r>
       <w:r>
         <w:rPr/>
-        <w:t>Calculated using logistic regression on Credit Score, Loan Amount, and Operational Risk Score</w:t>
+        <w:t>in-sample logistic regression on credit score, loan amount, and operational risk. LGD is not observed; illustrative loss uses a constant 45% LGD. EAD is loan amount. EL = PD × LGD × EAD.</w:t>
       </w:r>
     </w:p>
     <w:p>
@@ -526,7 +526,7 @@
       </w:r>
       <w:r>
         <w:rPr/>
-        <w:t>Computed at 95% and 99% confidence levels for Net Income under stress scenarios</w:t>
+        <w:t>Credit-loss VaR is a quantile of simulated portfolio loss. Borrower-income percentiles are reported separately and are not VaR.</w:t>
       </w:r>
     </w:p>
     <w:p>
@@ -548,7 +548,7 @@
       </w:r>
       <w:r>
         <w:rPr/>
-        <w:t>Included 20% revenue drop and 10% expense increase scenarios</w:t>
+        <w:t>a 20% revenue drop and a 10% expense increase. This does not change PD or expected loss. Credit stress: systematic factor at its 5th percentile.</w:t>
       </w:r>
     </w:p>
     <w:p>
@@ -666,21 +666,21 @@
       </w:pPr>
       <w:r>
         <w:rPr/>
-        <w:t>The average probability of default across the portfolio is 29.80%, indicating significant credit risk exposure. The distribution analysis reveals:</w:t>
-      </w:r>
-    </w:p>
-    <w:p>
-      <w:pPr>
-        <w:pStyle w:val="ListParagraph"/>
-        <w:numPr>
-          <w:ilvl w:val="0"/>
-          <w:numId w:val="1"/>
-        </w:numPr>
-        <w:rPr/>
-      </w:pPr>
-      <w:r>
-        <w:rPr/>
-        <w:t>504 loans (50.4%) have PD &gt; 20%</w:t>
+        <w:t>The unweighted mean of in-sample account PDs is 29.80%. The EAD-weighted mean is 17.23% because higher-PD loans are smaller. These PDs are the full-sample logistic fit, not a holdout validation.</w:t>
+      </w:r>
+    </w:p>
+    <w:p>
+      <w:pPr>
+        <w:pStyle w:val="ListParagraph"/>
+        <w:numPr>
+          <w:ilvl w:val="0"/>
+          <w:numId w:val="1"/>
+        </w:numPr>
+        <w:rPr/>
+      </w:pPr>
+      <w:r>
+        <w:rPr/>
+        <w:t>504 loans have PD above 20% (50.4% of count and 29.72% of EAD)</w:t>
       </w:r>
     </w:p>
     <w:p>
@@ -709,7 +709,7 @@
       </w:pPr>
       <w:r>
         <w:rPr/>
-        <w:t>Operational risk score acts as a multiplier on baseline default risk</w:t>
+        <w:t>Operational risk score is barely associated with default (correlation 0.02)</w:t>
       </w:r>
     </w:p>
     <w:p>
@@ -854,24 +854,24 @@
       </w:pPr>
       <w:r>
         <w:rPr/>
-        <w:t>VaR analysis provides insights into potential losses under adverse market conditions:</w:t>
-      </w:r>
-    </w:p>
-    <w:p>
-      <w:pPr>
-        <w:pStyle w:val="ListParagraph"/>
-        <w:numPr>
-          <w:ilvl w:val="0"/>
-          <w:numId w:val="1"/>
-        </w:numPr>
-        <w:rPr/>
-      </w:pPr>
-      <w:r>
-        <w:rPr>
-          <w:b/>
-          <w:bCs/>
-        </w:rPr>
-        <w:t xml:space="preserve">VaR (95% confidence): </w:t>
+        <w:t>The next two figures are percentiles of borrower net income per account. They were mislabeled as VaR in the February 2023 draft. A loss VaR cannot be smaller at 99% than at 95%.</w:t>
+      </w:r>
+    </w:p>
+    <w:p>
+      <w:pPr>
+        <w:pStyle w:val="ListParagraph"/>
+        <w:numPr>
+          <w:ilvl w:val="0"/>
+          <w:numId w:val="1"/>
+        </w:numPr>
+        <w:rPr/>
+      </w:pPr>
+      <w:r>
+        <w:rPr>
+          <w:b/>
+          <w:bCs/>
+        </w:rPr>
+        <w:t xml:space="preserve">5th percentile of borrower net income: </w:t>
       </w:r>
       <w:r>
         <w:rPr/>
@@ -893,7 +893,7 @@
           <w:b/>
           <w:bCs/>
         </w:rPr>
-        <w:t xml:space="preserve">VaR (99% confidence): </w:t>
+        <w:t xml:space="preserve">1st percentile of borrower net income: </w:t>
       </w:r>
       <w:r>
         <w:rPr/>
@@ -915,7 +915,7 @@
       </w:r>
       <w:r>
         <w:rPr/>
-        <w:t>In 5% of worst-case scenarios, the portfolio could experience net income below $43,147 per customer, representing significant tail risk exposure.</w:t>
+        <w:t>Those income percentiles are dollars per borrower, not a portfolio credit loss. Under an assumed LGD of 45% and an asset correlation of 0.15 (20,000 draws, seed 42), illustrative portfolio credit-loss VaR is $9,526,628.91 at 95% and $11,936,201.30 at 99%. Expected loss on that assumption is $5,280,499.32. LGD and correlation are not estimated from this file.</w:t>
       </w:r>
     </w:p>
     <w:p>
@@ -1020,7 +1020,7 @@
                 <w:bCs/>
                 <w:color w:val="FFFFFF"/>
               </w:rPr>
-              <w:t>Total Net Income</w:t>
+              <w:t>Aggregate borrower net income</w:t>
             </w:r>
           </w:p>
         </w:tc>
@@ -1093,7 +1093,7 @@
             </w:pPr>
             <w:r>
               <w:rPr/>
-              <w:t>$124,207,710.74</w:t>
+              <w:t>$124,207,710.82</w:t>
             </w:r>
           </w:p>
         </w:tc>
@@ -1115,7 +1115,7 @@
             </w:pPr>
             <w:r>
               <w:rPr/>
-              <w:t>Normal operating conditions</w:t>
+              <w:t>Revenue minus expenses. The Net_Income column sums to $124,207,710.74 ($0.08 rounding gap).</w:t>
             </w:r>
           </w:p>
         </w:tc>
@@ -1181,7 +1181,7 @@
             </w:pPr>
             <w:r>
               <w:rPr/>
-              <w:t>Significant exposure in consumer lending segment; 80% reduction in profitability</w:t>
+              <w:t>Aggregate borrower net income falls 80.07%. The file has no segment column.</w:t>
             </w:r>
           </w:p>
         </w:tc>
@@ -1250,7 +1250,7 @@
             </w:pPr>
             <w:r>
               <w:rPr/>
-              <w:t>Operational inefficiencies identified; 30% profit erosion</w:t>
+              <w:t>Aggregate borrower net income falls 30.04%. This is not lender profit.</w:t>
             </w:r>
           </w:p>
         </w:tc>
@@ -1328,7 +1328,7 @@
                 <w:b/>
                 <w:bCs/>
               </w:rPr>
-              <w:t>Severe market downturn; portfolio becomes unprofitable</w:t>
+              <w:t>Aggregate borrower net income is negative. This is not expected credit loss.</w:t>
             </w:r>
           </w:p>
         </w:tc>
@@ -1424,7 +1424,7 @@
       </w:pPr>
       <w:r>
         <w:rPr/>
-        <w:t>Analysis of operational risk scores reveals critical vulnerabilities:</w:t>
+        <w:t>Operational risk scores on this book:</w:t>
       </w:r>
     </w:p>
     <w:p>
@@ -1445,7 +1445,7 @@
       </w:r>
       <w:r>
         <w:rPr/>
-        <w:t>Customers with operational risk scores above 60 show 2.5x higher default rates</w:t>
+        <w:t>Customers with operational risk above 60 default at 29.67% (27 of 91), versus 29.81% (271 of 909) for the rest</w:t>
       </w:r>
     </w:p>
     <w:p>
@@ -1466,7 +1466,7 @@
       </w:r>
       <w:r>
         <w:rPr/>
-        <w:t>Operational risks compound credit risks, especially in low credit score segments</w:t>
+        <w:t>This file does not show a higher default rate when the operational risk score is already high</w:t>
       </w:r>
     </w:p>
     <w:p>
@@ -1502,7 +1502,7 @@
           <w:b/>
           <w:bCs/>
         </w:rPr>
-        <w:t>Figure 4: Operational Risk Score Distribution</w:t>
+        <w:t>Figure 4: High-PD concentration and operational-risk default rates</w:t>
       </w:r>
     </w:p>
     <w:p>
@@ -1648,7 +1648,7 @@
       </w:r>
       <w:r>
         <w:rPr/>
-        <w:t>Establish enhanced process monitoring for accounts with operational risk scores above 60. Implement automated alerts and quarterly reviews. Invest in process optimization initiatives to reduce operational inefficiencies.</w:t>
+        <w:t>Do not treat an operational risk score above 60 as a default screen on this book: that band's default rate matches the rest. Monitoring can still be an operational control.</w:t>
       </w:r>
     </w:p>
     <w:p>
@@ -1680,7 +1680,7 @@
       </w:r>
       <w:r>
         <w:rPr/>
-        <w:t>Develop comprehensive contingency plans for revenue drops and cost spikes. Establish buffer capital equivalent to at least 15% of total loan portfolio ($10.2M) to withstand combined stress scenarios. Create rapid response protocols for market downturns.</w:t>
+        <w:t>Size any capital buffer from credit-loss expected loss and VaR. Those figures depend on an LGD and a correlation this file does not contain. Do not size the buffer from the borrower-income stress.</w:t>
       </w:r>
     </w:p>
     <w:p>
@@ -1712,7 +1712,7 @@
       </w:r>
       <w:r>
         <w:rPr/>
-        <w:t>Reduce concentration in high-risk segments (currently 50.4% of portfolio). Target a more balanced distribution with no more than 30% of loans in the high-risk category. Explore opportunities in lower-risk, stable-income customer segments.</w:t>
+        <w:t>High-PD loans are 50.4% of count and 29.72% of EAD. Exposure concentration is the figure to manage. A 30% cap would be a policy choice, not a result from this file.</w:t>
       </w:r>
     </w:p>
     <w:p>
@@ -1839,7 +1839,7 @@
       </w:pPr>
       <w:r>
         <w:rPr/>
-        <w:t>Clear correlation between operational risk and credit default probability</w:t>
+        <w:t>Credit score, not operational risk, is the variable associated with default</w:t>
       </w:r>
     </w:p>
     <w:p>
@@ -1865,7 +1865,7 @@
       </w:pPr>
       <w:r>
         <w:rPr/>
-        <w:t>The methodologies applied — logistic regression for PD modeling, percentile-based VaR calculation, and scenario-based stress testing — represent industry-standard approaches to enterprise risk management. The insights generated provide a solid foundation for informed capital allocation, portfolio optimization, and strategic planning.</w:t>
+        <w:t>The PD model is an in-sample logistic regression. Credit-loss VaR here is a simulated loss quantile under stated assumptions, not a Basel capital number. Borrower earnings stress is reported separately from expected loss.</w:t>
       </w:r>
     </w:p>
     <w:p>
@@ -1876,7 +1876,7 @@
       </w:pPr>
       <w:r>
         <w:rPr/>
-        <w:t>Implementation of the recommended risk mitigation strategies is expected to reduce portfolio PD by 8-12 percentage points, improve stress test outcomes by 20-25%, and enhance overall risk-adjusted returns. Continued monitoring and iterative refinement of risk models will be essential to maintaining portfolio health in dynamic market conditions.</w:t>
+        <w:t>The draft assigned the recommendations a PD reduction and a stress improvement. Those effects were not estimated, and they are not reported here.</w:t>
       </w:r>
     </w:p>
     <w:p>
@@ -1956,7 +1956,7 @@
       </w:pPr>
       <w:r>
         <w:rPr/>
-        <w:t>Where the model captures the non-linear relationship between credit quality and default risk, with operational risk acting as a multiplier effect.</w:t>
+        <w:t>The published PD is the in-sample fit. Operational risk is not a multiplier on this book. Out-of-fold AUC is 0.852. Loan amount is collinear with credit score (correlation 0.92); its positive coefficient is not a standalone size effect.</w:t>
       </w:r>
     </w:p>
     <w:p>
@@ -2065,7 +2065,7 @@
       </w:pPr>
       <w:r>
         <w:rPr/>
-        <w:t>Net Portfolio Income: $124,207,710.74</w:t>
+        <w:t>Sum of the Net_Income column: $124,207,710.74. Revenue minus expenses is $124,207,710.82.</w:t>
       </w:r>
     </w:p>
     <w:p>
@@ -2086,7 +2086,7 @@
       </w:pPr>
       <w:r>
         <w:rPr/>
-        <w:t>All analytical methods employed in this report follow industry best practices:</w:t>
+        <w:t>Notes on the methods:</w:t>
       </w:r>
     </w:p>
     <w:p>
@@ -2128,7 +2128,7 @@
       </w:r>
       <w:r>
         <w:rPr/>
-        <w:t>Standard metric prescribed by Basel III regulatory framework</w:t>
+        <w:t>a loss quantile. The illustrative figure is not regulatory capital.</w:t>
       </w:r>
     </w:p>
     <w:p>
@@ -2149,7 +2149,7 @@
       </w:r>
       <w:r>
         <w:rPr/>
-        <w:t>Aligns with Federal Reserve CCAR (Comprehensive Capital Analysis and Review) guidelines</w:t>
+        <w:t>borrower earnings shocks are separate from credit-loss shocks. This is not a CCAR submission.</w:t>
       </w:r>
     </w:p>
     <w:p>

</xml_diff>

<commit_message>
Report validation intervals, VaR simulation error, and scorecard attributions
The executive-snapshot point estimates are unchanged. Out-of-fold AUC
now carries a DeLong interval, Gini, KS, calibration, and a credit-score-only
comparison. Credit-loss VaR and expected shortfall keep the same seeded
dollars, with a bootstrap band for Monte Carlo error. Exact Shapley values
attribute the in-sample logit without treating the loan-amount partial
effect as a standalone size effect.

Co-authored-by: Par Bahrae <githubproproject@proton.me>
</commit_message>
<xml_diff>
--- a/Risk_Assessment_Report.docx
+++ b/Risk_Assessment_Report.docx
@@ -915,7 +915,7 @@
       </w:r>
       <w:r>
         <w:rPr/>
-        <w:t>Those income percentiles are dollars per borrower, not a portfolio credit loss. Under an assumed LGD of 45% and an asset correlation of 0.15 (20,000 draws, seed 42), illustrative portfolio credit-loss VaR is $9,526,628.91 at 95% and $11,936,201.30 at 99%. Expected loss on that assumption is $5,280,499.32. LGD and correlation are not estimated from this file.</w:t>
+        <w:t>Those income percentiles are dollars per borrower, not a portfolio credit loss. Under an assumed LGD of 45% and an asset correlation of 0.15 (20,000 draws, seed 42), illustrative portfolio credit-loss VaR is $9,526,628.91 at 95% and $11,936,201.30 at 99%. Expected loss on that assumption is $5,280,499.32. A bootstrap 95% interval for the Monte Carlo error is $9,436,973.61 to $9,622,340.47 at 95% and $11,768,211.11 to $12,085,866.62 at 99%. The copula has no tail dependence, and LGD does not worsen in the tail. LGD and correlation are not estimated from this file.</w:t>
       </w:r>
     </w:p>
     <w:p>
@@ -1956,7 +1956,7 @@
       </w:pPr>
       <w:r>
         <w:rPr/>
-        <w:t>The published PD is the in-sample fit. Operational risk is not a multiplier on this book. Out-of-fold AUC is 0.852. Loan amount is collinear with credit score (correlation 0.92); its positive coefficient is not a standalone size effect.</w:t>
+        <w:t>The published PD is the in-sample fit. Operational risk is not a multiplier on this book. Out-of-fold AUC is 0.852 (DeLong 95% CI 0.828 to 0.877). A credit-score-only model has out-of-fold AUC 0.853, and that difference includes zero. Loan amount is collinear with credit score (correlation 0.92); its positive coefficient is not a standalone size effect. Exact probability-scale Shapley values attribute the score mainly to credit score; the loan-amount piece follows that partial coefficient, not the raw association with default.</w:t>
       </w:r>
     </w:p>
     <w:p>

</xml_diff>

<commit_message>
Report validation intervals, VaR simulation error, and scorecard attributions (#6)
The executive-snapshot point estimates are unchanged. Out-of-fold AUC
now carries a DeLong interval, Gini, KS, calibration, and a credit-score-only
comparison. Credit-loss VaR and expected shortfall keep the same seeded
dollars, with a bootstrap band for Monte Carlo error. Exact Shapley values
attribute the in-sample logit without treating the loan-amount partial
effect as a standalone size effect.

Co-authored-by: Cursor Agent <cursoragent@cursor.com>
</commit_message>
<xml_diff>
--- a/Risk_Assessment_Report.docx
+++ b/Risk_Assessment_Report.docx
@@ -915,7 +915,7 @@
       </w:r>
       <w:r>
         <w:rPr/>
-        <w:t>Those income percentiles are dollars per borrower, not a portfolio credit loss. Under an assumed LGD of 45% and an asset correlation of 0.15 (20,000 draws, seed 42), illustrative portfolio credit-loss VaR is $9,526,628.91 at 95% and $11,936,201.30 at 99%. Expected loss on that assumption is $5,280,499.32. LGD and correlation are not estimated from this file.</w:t>
+        <w:t>Those income percentiles are dollars per borrower, not a portfolio credit loss. Under an assumed LGD of 45% and an asset correlation of 0.15 (20,000 draws, seed 42), illustrative portfolio credit-loss VaR is $9,526,628.91 at 95% and $11,936,201.30 at 99%. Expected loss on that assumption is $5,280,499.32. A bootstrap 95% interval for the Monte Carlo error is $9,436,973.61 to $9,622,340.47 at 95% and $11,768,211.11 to $12,085,866.62 at 99%. The copula has no tail dependence, and LGD does not worsen in the tail. LGD and correlation are not estimated from this file.</w:t>
       </w:r>
     </w:p>
     <w:p>
@@ -1956,7 +1956,7 @@
       </w:pPr>
       <w:r>
         <w:rPr/>
-        <w:t>The published PD is the in-sample fit. Operational risk is not a multiplier on this book. Out-of-fold AUC is 0.852. Loan amount is collinear with credit score (correlation 0.92); its positive coefficient is not a standalone size effect.</w:t>
+        <w:t>The published PD is the in-sample fit. Operational risk is not a multiplier on this book. Out-of-fold AUC is 0.852 (DeLong 95% CI 0.828 to 0.877). A credit-score-only model has out-of-fold AUC 0.853, and that difference includes zero. Loan amount is collinear with credit score (correlation 0.92); its positive coefficient is not a standalone size effect. Exact probability-scale Shapley values attribute the score mainly to credit score; the loan-amount piece follows that partial coefficient, not the raw association with default.</w:t>
       </w:r>
     </w:p>
     <w:p>

</xml_diff>

<commit_message>
Remove pasted screenshots and rewrite the notes
The duplicate "Pasted image" files included a chart that claimed
operational risk above 60 had a 2.5x default rate. The loan file
does not show that. The README, generated note, and memo now only
state figures the code computes, and local agent files are ignored.

Co-authored-by: Par Bahrae <ParBproject@users.noreply.github.com>
</commit_message>
<xml_diff>
--- a/Risk_Assessment_Report.docx
+++ b/Risk_Assessment_Report.docx
@@ -33,7 +33,7 @@
           <w:sz w:val="32"/>
           <w:szCs w:val="32"/>
         </w:rPr>
-        <w:t>Financial &amp; Operational Risk Analysis</w:t>
+        <w:t>Case study on a synthetic loan book</w:t>
       </w:r>
     </w:p>
     <w:tbl>
@@ -96,7 +96,7 @@
             </w:pPr>
             <w:r>
               <w:rPr/>
-              <w:t>Portfolio Risk Analysis - Financial Services</w:t>
+              <w:t>Portfolio credit risk (synthetic book)</w:t>
             </w:r>
           </w:p>
         </w:tc>
@@ -144,7 +144,7 @@
             </w:pPr>
             <w:r>
               <w:rPr/>
-              <w:t>Risk Analytics Team</w:t>
+              <w:t>Par Bahrae</w:t>
             </w:r>
           </w:p>
         </w:tc>
@@ -219,7 +219,7 @@
       </w:pPr>
       <w:r>
         <w:rPr/>
-        <w:t>1. Executive Summary</w:t>
+        <w:t>1. Summary</w:t>
       </w:r>
     </w:p>
     <w:p>
@@ -230,7 +230,7 @@
       </w:pPr>
       <w:r>
         <w:rPr/>
-        <w:t>This report evaluates the financial and operational risks of a simulated loan portfolio comprising 1,000 customer accounts. Key objectives include:</w:t>
+        <w:t>Notes on a synthetic book of 1,000 loans. The figures come from portfolio_data.csv and the code in this repository.</w:t>
       </w:r>
     </w:p>
     <w:p>
@@ -244,35 +244,35 @@
       </w:pPr>
       <w:r>
         <w:rPr/>
-        <w:t>Quantifying the probability of loan defaults</w:t>
-      </w:r>
-    </w:p>
-    <w:p>
-      <w:pPr>
-        <w:pStyle w:val="ListParagraph"/>
-        <w:numPr>
-          <w:ilvl w:val="0"/>
-          <w:numId w:val="1"/>
-        </w:numPr>
-        <w:rPr/>
-      </w:pPr>
-      <w:r>
-        <w:rPr/>
-        <w:t>Estimating Value at Risk (VaR) under adverse scenarios</w:t>
-      </w:r>
-    </w:p>
-    <w:p>
-      <w:pPr>
-        <w:pStyle w:val="ListParagraph"/>
-        <w:numPr>
-          <w:ilvl w:val="0"/>
-          <w:numId w:val="1"/>
-        </w:numPr>
-        <w:rPr/>
-      </w:pPr>
-      <w:r>
-        <w:rPr/>
-        <w:t>Performing stress testing to assess operational vulnerabilities</w:t>
+        <w:t>Account PD from the in-sample scorecard</w:t>
+      </w:r>
+    </w:p>
+    <w:p>
+      <w:pPr>
+        <w:pStyle w:val="ListParagraph"/>
+        <w:numPr>
+          <w:ilvl w:val="0"/>
+          <w:numId w:val="1"/>
+        </w:numPr>
+        <w:rPr/>
+      </w:pPr>
+      <w:r>
+        <w:rPr/>
+        <w:t>A simulated credit-loss distribution under a stated LGD and correlation</w:t>
+      </w:r>
+    </w:p>
+    <w:p>
+      <w:pPr>
+        <w:pStyle w:val="ListParagraph"/>
+        <w:numPr>
+          <w:ilvl w:val="0"/>
+          <w:numId w:val="1"/>
+        </w:numPr>
+        <w:rPr/>
+      </w:pPr>
+      <w:r>
+        <w:rPr/>
+        <w:t>A borrower-earnings stress, kept separate from credit loss</w:t>
       </w:r>
     </w:p>
     <w:p>
@@ -287,7 +287,7 @@
       </w:pPr>
       <w:r>
         <w:rPr/>
-        <w:t>Providing actionable recommendations to mitigate risk</w:t>
+        <w:t>What the file does not identify</w:t>
       </w:r>
     </w:p>
     <w:p>
@@ -378,7 +378,7 @@
       </w:pPr>
       <w:r>
         <w:rPr/>
-        <w:t>2.1 Data Collection &amp; Cleaning</w:t>
+        <w:t>2.1 Loan file</w:t>
       </w:r>
     </w:p>
     <w:p>
@@ -389,7 +389,7 @@
       </w:pPr>
       <w:r>
         <w:rPr/>
-        <w:t>Dataset includes 1000 loans with comprehensive financial and operational metrics. Total loan portfolio value: $68,121,079.07.</w:t>
+        <w:t>The file has 1,000 loans. Total loan amount is $68,121,079.07.</w:t>
       </w:r>
     </w:p>
     <w:p>
@@ -445,7 +445,7 @@
       </w:pPr>
       <w:r>
         <w:rPr/>
-        <w:t>Operational Risk Score (0-100 scale)</w:t>
+        <w:t>Operational risk score (0.0 to 98.9)</w:t>
       </w:r>
     </w:p>
     <w:p>
@@ -558,7 +558,7 @@
       </w:pPr>
       <w:r>
         <w:rPr/>
-        <w:t>2.3 Tools Used</w:t>
+        <w:t>2.3 Code</w:t>
       </w:r>
     </w:p>
     <w:p>
@@ -618,11 +618,11 @@
           <w:b/>
           <w:bCs/>
         </w:rPr>
-        <w:t xml:space="preserve">Statistical Analysis: </w:t>
-      </w:r>
-      <w:r>
-        <w:rPr/>
-        <w:t>VaR calculations, scenario modeling, probability distributions</w:t>
+        <w:t xml:space="preserve">SciPy: </w:t>
+      </w:r>
+      <w:r>
+        <w:rPr/>
+        <w:t>the Gaussian copula and the DeLong AUC interval</w:t>
       </w:r>
     </w:p>
     <w:p>
@@ -854,7 +854,7 @@
       </w:pPr>
       <w:r>
         <w:rPr/>
-        <w:t>The next two figures are percentiles of borrower net income per account. They were mislabeled as VaR in the February 2023 draft. A loss VaR cannot be smaller at 99% than at 95%.</w:t>
+        <w:t>The draft labeled two borrower-income percentiles as VaR. A loss VaR cannot be smaller at 99% than at 95%.</w:t>
       </w:r>
     </w:p>
     <w:p>
@@ -949,7 +949,7 @@
       </w:pPr>
       <w:r>
         <w:rPr/>
-        <w:t>Comprehensive stress testing reveals portfolio resilience under various adverse scenarios:</w:t>
+        <w:t>Revenue and expense shocks change aggregate borrower net income. They do not change PD or expected loss.</w:t>
       </w:r>
     </w:p>
     <w:tbl>
@@ -1441,54 +1441,11 @@
           <w:b/>
           <w:bCs/>
         </w:rPr>
-        <w:t xml:space="preserve">High-risk segments: </w:t>
+        <w:t xml:space="preserve">Above 60: </w:t>
       </w:r>
       <w:r>
         <w:rPr/>
         <w:t>Customers with operational risk above 60 default at 29.67% (27 of 91), versus 29.81% (271 of 909) for the rest</w:t>
-      </w:r>
-    </w:p>
-    <w:p>
-      <w:pPr>
-        <w:pStyle w:val="ListParagraph"/>
-        <w:numPr>
-          <w:ilvl w:val="0"/>
-          <w:numId w:val="1"/>
-        </w:numPr>
-        <w:rPr/>
-      </w:pPr>
-      <w:r>
-        <w:rPr>
-          <w:b/>
-          <w:bCs/>
-        </w:rPr>
-        <w:t xml:space="preserve">Process inefficiencies: </w:t>
-      </w:r>
-      <w:r>
-        <w:rPr/>
-        <w:t>This file does not show a higher default rate when the operational risk score is already high</w:t>
-      </w:r>
-    </w:p>
-    <w:p>
-      <w:pPr>
-        <w:pStyle w:val="ListParagraph"/>
-        <w:numPr>
-          <w:ilvl w:val="0"/>
-          <w:numId w:val="1"/>
-        </w:numPr>
-        <w:spacing w:before="0" w:after="240"/>
-        <w:rPr/>
-      </w:pPr>
-      <w:r>
-        <w:rPr>
-          <w:b/>
-          <w:bCs/>
-        </w:rPr>
-        <w:t xml:space="preserve">Monitoring gaps: </w:t>
-      </w:r>
-      <w:r>
-        <w:rPr/>
-        <w:t>Current systems lack real-time tracking of operational risk indicators</w:t>
       </w:r>
     </w:p>
     <w:p>
@@ -1573,7 +1530,7 @@
       </w:pPr>
       <w:r>
         <w:rPr/>
-        <w:t>4. Recommendations</w:t>
+        <w:t>4. Reading the results</w:t>
       </w:r>
     </w:p>
     <w:p>
@@ -1584,7 +1541,7 @@
       </w:pPr>
       <w:r>
         <w:rPr/>
-        <w:t>Based on the comprehensive risk analysis, the following strategic recommendations are proposed:</w:t>
+        <w:t>The notes below are judgment. This file does not measure their effect.</w:t>
       </w:r>
     </w:p>
     <w:p>
@@ -1601,7 +1558,7 @@
           <w:b/>
           <w:bCs/>
         </w:rPr>
-        <w:t>Credit Risk Mitigation</w:t>
+        <w:t>High-PD loans</w:t>
       </w:r>
     </w:p>
     <w:p>
@@ -1616,7 +1573,7 @@
       </w:r>
       <w:r>
         <w:rPr/>
-        <w:t>Implement stricter lending criteria for loans with PD &gt; 20%. Consider requiring additional collateral or higher interest rates for high-risk borrowers. Recommended actions include credit score threshold adjustments and enhanced underwriting processes.</w:t>
+        <w:t>Loans with PD above 20% are 50.4% of the count and 29.72% of EAD. A tighter screen on that band would be a policy choice. The file does not show what it would do to defaults.</w:t>
       </w:r>
     </w:p>
     <w:p>
@@ -1633,7 +1590,7 @@
           <w:b/>
           <w:bCs/>
         </w:rPr>
-        <w:t>Operational Risk Management</w:t>
+        <w:t>Operational risk</w:t>
       </w:r>
     </w:p>
     <w:p>
@@ -1648,7 +1605,7 @@
       </w:r>
       <w:r>
         <w:rPr/>
-        <w:t>Do not treat an operational risk score above 60 as a default screen on this book: that band's default rate matches the rest. Monitoring can still be an operational control.</w:t>
+        <w:t>An operational risk score above 60 is not a default screen on this book. That band defaults at the same rate as the rest (27 of 91).</w:t>
       </w:r>
     </w:p>
     <w:p>
@@ -1665,7 +1622,7 @@
           <w:b/>
           <w:bCs/>
         </w:rPr>
-        <w:t>Stress Test Preparedness</w:t>
+        <w:t>Credit loss and earnings</w:t>
       </w:r>
     </w:p>
     <w:p>
@@ -1697,7 +1654,7 @@
           <w:b/>
           <w:bCs/>
         </w:rPr>
-        <w:t>Portfolio Diversification</w:t>
+        <w:t>Concentration</w:t>
       </w:r>
     </w:p>
     <w:p>
@@ -1712,24 +1669,17 @@
       </w:r>
       <w:r>
         <w:rPr/>
-        <w:t>High-PD loans are 50.4% of count and 29.72% of EAD. Exposure concentration is the figure to manage. A 30% cap would be a policy choice, not a result from this file.</w:t>
-      </w:r>
-    </w:p>
-    <w:p>
-      <w:pPr>
-        <w:pStyle w:val="ListParagraph"/>
-        <w:numPr>
-          <w:ilvl w:val="0"/>
-          <w:numId w:val="2"/>
-        </w:numPr>
-        <w:rPr/>
-      </w:pPr>
-      <w:r>
-        <w:rPr>
-          <w:b/>
-          <w:bCs/>
-        </w:rPr>
-        <w:t>Monitoring &amp; Reporting Infrastructure</w:t>
+        <w:t>High-PD loans are 50.4% of count and 29.72% of EAD. The exposure share is the concentration figure. The file does not identify a cap.</w:t>
+      </w:r>
+    </w:p>
+    <w:p>
+      <w:pPr>
+        <w:pStyle w:val="Heading1"/>
+        <w:rPr/>
+      </w:pPr>
+      <w:r>
+        <w:rPr/>
+        <w:t>5. Conclusion</w:t>
       </w:r>
     </w:p>
     <w:p>
@@ -1740,92 +1690,35 @@
       </w:pPr>
       <w:r>
         <w:rPr/>
-        <w:t xml:space="preserve">   </w:t>
-      </w:r>
-      <w:r>
-        <w:rPr/>
-        <w:t>Deploy real-time dashboards tracking PD, VaR, and operational KPIs. Implement automated reporting systems with weekly executive summaries and monthly deep-dive analyses. Integrate predictive analytics for early warning signals.</w:t>
-      </w:r>
-    </w:p>
-    <w:p>
-      <w:pPr>
-        <w:pStyle w:val="ListParagraph"/>
-        <w:numPr>
-          <w:ilvl w:val="0"/>
-          <w:numId w:val="2"/>
-        </w:numPr>
-        <w:rPr/>
-      </w:pPr>
-      <w:r>
-        <w:rPr>
-          <w:b/>
-          <w:bCs/>
-        </w:rPr>
-        <w:t>Risk-Adjusted Pricing Strategy</w:t>
-      </w:r>
-    </w:p>
-    <w:p>
-      <w:pPr>
-        <w:pStyle w:val="Normal"/>
-        <w:spacing w:before="0" w:after="360"/>
-        <w:rPr/>
-      </w:pPr>
-      <w:r>
-        <w:rPr/>
-        <w:t xml:space="preserve">   </w:t>
-      </w:r>
-      <w:r>
-        <w:rPr/>
-        <w:t>Implement dynamic pricing models that adjust interest rates based on real-time PD calculations. Ensure that high-risk loans are priced to compensate for increased default probability. Target risk-adjusted returns of 12-15% across the portfolio.</w:t>
-      </w:r>
-    </w:p>
-    <w:p>
-      <w:pPr>
-        <w:pStyle w:val="Heading1"/>
-        <w:rPr/>
-      </w:pPr>
-      <w:r>
-        <w:rPr/>
-        <w:t>5. Conclusion</w:t>
-      </w:r>
-    </w:p>
-    <w:p>
-      <w:pPr>
-        <w:pStyle w:val="Normal"/>
-        <w:spacing w:before="0" w:after="180"/>
-        <w:rPr/>
-      </w:pPr>
-      <w:r>
-        <w:rPr/>
-        <w:t>This comprehensive risk assessment demonstrates advanced capabilities in quantifying financial and operational risks, simulating adverse scenarios, and proposing data-driven mitigation strategies. The analysis reveals:</w:t>
-      </w:r>
-    </w:p>
-    <w:p>
-      <w:pPr>
-        <w:pStyle w:val="ListParagraph"/>
-        <w:numPr>
-          <w:ilvl w:val="0"/>
-          <w:numId w:val="1"/>
-        </w:numPr>
-        <w:rPr/>
-      </w:pPr>
-      <w:r>
-        <w:rPr/>
-        <w:t>A portfolio with elevated credit risk, requiring immediate attention to high-PD segments</w:t>
-      </w:r>
-    </w:p>
-    <w:p>
-      <w:pPr>
-        <w:pStyle w:val="ListParagraph"/>
-        <w:numPr>
-          <w:ilvl w:val="0"/>
-          <w:numId w:val="1"/>
-        </w:numPr>
-        <w:rPr/>
-      </w:pPr>
-      <w:r>
-        <w:rPr/>
-        <w:t>Significant vulnerability to revenue shocks, particularly in combined stress scenarios</w:t>
+        <w:t>On this book:</w:t>
+      </w:r>
+    </w:p>
+    <w:p>
+      <w:pPr>
+        <w:pStyle w:val="ListParagraph"/>
+        <w:numPr>
+          <w:ilvl w:val="0"/>
+          <w:numId w:val="1"/>
+        </w:numPr>
+        <w:rPr/>
+      </w:pPr>
+      <w:r>
+        <w:rPr/>
+        <w:t>Unweighted mean PD is 29.80%. EAD-weighted PD is 17.23%, because higher-PD loans are smaller.</w:t>
+      </w:r>
+    </w:p>
+    <w:p>
+      <w:pPr>
+        <w:pStyle w:val="ListParagraph"/>
+        <w:numPr>
+          <w:ilvl w:val="0"/>
+          <w:numId w:val="1"/>
+        </w:numPr>
+        <w:rPr/>
+      </w:pPr>
+      <w:r>
+        <w:rPr/>
+        <w:t>Combined, aggregate borrower net income is -$12,559,240.00. That figure is not credit loss.</w:t>
       </w:r>
     </w:p>
     <w:p>
@@ -1840,21 +1733,6 @@
       <w:r>
         <w:rPr/>
         <w:t>Credit score, not operational risk, is the variable associated with default</w:t>
-      </w:r>
-    </w:p>
-    <w:p>
-      <w:pPr>
-        <w:pStyle w:val="ListParagraph"/>
-        <w:numPr>
-          <w:ilvl w:val="0"/>
-          <w:numId w:val="1"/>
-        </w:numPr>
-        <w:spacing w:before="0" w:after="240"/>
-        <w:rPr/>
-      </w:pPr>
-      <w:r>
-        <w:rPr/>
-        <w:t>Quantifiable risk metrics that can guide strategic decision-making</w:t>
       </w:r>
     </w:p>
     <w:p>
@@ -2103,11 +1981,11 @@
           <w:b/>
           <w:bCs/>
         </w:rPr>
-        <w:t xml:space="preserve">Logistic Regression: </w:t>
-      </w:r>
-      <w:r>
-        <w:rPr/>
-        <w:t>Widely used by financial institutions for binary classification and PD modeling</w:t>
+        <w:t xml:space="preserve">Scorecard: </w:t>
+      </w:r>
+      <w:r>
+        <w:rPr/>
+        <w:t>unpenalized logistic regression on credit score, loan amount, and operational risk. The published PD is the in-sample fit, not a holdout.</w:t>
       </w:r>
     </w:p>
     <w:p>
@@ -2149,7 +2027,7 @@
       </w:r>
       <w:r>
         <w:rPr/>
-        <w:t>borrower earnings shocks are separate from credit-loss shocks. This is not a CCAR submission.</w:t>
+        <w:t>borrower earnings shocks are separate from the credit-loss simulation.</w:t>
       </w:r>
     </w:p>
     <w:p>
@@ -2173,63 +2051,7 @@
           <w:b/>
           <w:bCs/>
         </w:rPr>
-        <w:t>Report prepared using Python (NumPy, Pandas, Scikit-learn, Matplotlib), demonstrating proficiency in:</w:t>
-      </w:r>
-    </w:p>
-    <w:p>
-      <w:pPr>
-        <w:pStyle w:val="ListParagraph"/>
-        <w:numPr>
-          <w:ilvl w:val="0"/>
-          <w:numId w:val="1"/>
-        </w:numPr>
-        <w:rPr/>
-      </w:pPr>
-      <w:r>
-        <w:rPr/>
-        <w:t>Statistical modeling and machine learning</w:t>
-      </w:r>
-    </w:p>
-    <w:p>
-      <w:pPr>
-        <w:pStyle w:val="ListParagraph"/>
-        <w:numPr>
-          <w:ilvl w:val="0"/>
-          <w:numId w:val="1"/>
-        </w:numPr>
-        <w:rPr/>
-      </w:pPr>
-      <w:r>
-        <w:rPr/>
-        <w:t>Data visualization and presentation</w:t>
-      </w:r>
-    </w:p>
-    <w:p>
-      <w:pPr>
-        <w:pStyle w:val="ListParagraph"/>
-        <w:numPr>
-          <w:ilvl w:val="0"/>
-          <w:numId w:val="1"/>
-        </w:numPr>
-        <w:rPr/>
-      </w:pPr>
-      <w:r>
-        <w:rPr/>
-        <w:t>Financial risk analysis and stress testing</w:t>
-      </w:r>
-    </w:p>
-    <w:p>
-      <w:pPr>
-        <w:pStyle w:val="ListParagraph"/>
-        <w:numPr>
-          <w:ilvl w:val="0"/>
-          <w:numId w:val="1"/>
-        </w:numPr>
-        <w:rPr/>
-      </w:pPr>
-      <w:r>
-        <w:rPr/>
-        <w:t>Quantitative research and reporting</w:t>
+        <w:t>Charts and the numerical note are written by the Python code in this repository.</w:t>
       </w:r>
     </w:p>
     <w:sectPr>

</xml_diff>

<commit_message>
Remove pasted screenshots and rewrite the notes (#7)
The duplicate "Pasted image" files included a chart that claimed
operational risk above 60 had a 2.5x default rate. The loan file
does not show that. The README, generated note, and memo now only
state figures the code computes.
</commit_message>
<xml_diff>
--- a/Risk_Assessment_Report.docx
+++ b/Risk_Assessment_Report.docx
@@ -33,7 +33,7 @@
           <w:sz w:val="32"/>
           <w:szCs w:val="32"/>
         </w:rPr>
-        <w:t>Financial &amp; Operational Risk Analysis</w:t>
+        <w:t>Case study on a synthetic loan book</w:t>
       </w:r>
     </w:p>
     <w:tbl>
@@ -96,7 +96,7 @@
             </w:pPr>
             <w:r>
               <w:rPr/>
-              <w:t>Portfolio Risk Analysis - Financial Services</w:t>
+              <w:t>Portfolio credit risk (synthetic book)</w:t>
             </w:r>
           </w:p>
         </w:tc>
@@ -144,7 +144,7 @@
             </w:pPr>
             <w:r>
               <w:rPr/>
-              <w:t>Risk Analytics Team</w:t>
+              <w:t>Par Bahrae</w:t>
             </w:r>
           </w:p>
         </w:tc>
@@ -219,7 +219,7 @@
       </w:pPr>
       <w:r>
         <w:rPr/>
-        <w:t>1. Executive Summary</w:t>
+        <w:t>1. Summary</w:t>
       </w:r>
     </w:p>
     <w:p>
@@ -230,7 +230,7 @@
       </w:pPr>
       <w:r>
         <w:rPr/>
-        <w:t>This report evaluates the financial and operational risks of a simulated loan portfolio comprising 1,000 customer accounts. Key objectives include:</w:t>
+        <w:t>Notes on a synthetic book of 1,000 loans. The figures come from portfolio_data.csv and the code in this repository.</w:t>
       </w:r>
     </w:p>
     <w:p>
@@ -244,35 +244,35 @@
       </w:pPr>
       <w:r>
         <w:rPr/>
-        <w:t>Quantifying the probability of loan defaults</w:t>
-      </w:r>
-    </w:p>
-    <w:p>
-      <w:pPr>
-        <w:pStyle w:val="ListParagraph"/>
-        <w:numPr>
-          <w:ilvl w:val="0"/>
-          <w:numId w:val="1"/>
-        </w:numPr>
-        <w:rPr/>
-      </w:pPr>
-      <w:r>
-        <w:rPr/>
-        <w:t>Estimating Value at Risk (VaR) under adverse scenarios</w:t>
-      </w:r>
-    </w:p>
-    <w:p>
-      <w:pPr>
-        <w:pStyle w:val="ListParagraph"/>
-        <w:numPr>
-          <w:ilvl w:val="0"/>
-          <w:numId w:val="1"/>
-        </w:numPr>
-        <w:rPr/>
-      </w:pPr>
-      <w:r>
-        <w:rPr/>
-        <w:t>Performing stress testing to assess operational vulnerabilities</w:t>
+        <w:t>Account PD from the in-sample scorecard</w:t>
+      </w:r>
+    </w:p>
+    <w:p>
+      <w:pPr>
+        <w:pStyle w:val="ListParagraph"/>
+        <w:numPr>
+          <w:ilvl w:val="0"/>
+          <w:numId w:val="1"/>
+        </w:numPr>
+        <w:rPr/>
+      </w:pPr>
+      <w:r>
+        <w:rPr/>
+        <w:t>A simulated credit-loss distribution under a stated LGD and correlation</w:t>
+      </w:r>
+    </w:p>
+    <w:p>
+      <w:pPr>
+        <w:pStyle w:val="ListParagraph"/>
+        <w:numPr>
+          <w:ilvl w:val="0"/>
+          <w:numId w:val="1"/>
+        </w:numPr>
+        <w:rPr/>
+      </w:pPr>
+      <w:r>
+        <w:rPr/>
+        <w:t>A borrower-earnings stress, kept separate from credit loss</w:t>
       </w:r>
     </w:p>
     <w:p>
@@ -287,7 +287,7 @@
       </w:pPr>
       <w:r>
         <w:rPr/>
-        <w:t>Providing actionable recommendations to mitigate risk</w:t>
+        <w:t>What the file does not identify</w:t>
       </w:r>
     </w:p>
     <w:p>
@@ -378,7 +378,7 @@
       </w:pPr>
       <w:r>
         <w:rPr/>
-        <w:t>2.1 Data Collection &amp; Cleaning</w:t>
+        <w:t>2.1 Loan file</w:t>
       </w:r>
     </w:p>
     <w:p>
@@ -389,7 +389,7 @@
       </w:pPr>
       <w:r>
         <w:rPr/>
-        <w:t>Dataset includes 1000 loans with comprehensive financial and operational metrics. Total loan portfolio value: $68,121,079.07.</w:t>
+        <w:t>The file has 1,000 loans. Total loan amount is $68,121,079.07.</w:t>
       </w:r>
     </w:p>
     <w:p>
@@ -445,7 +445,7 @@
       </w:pPr>
       <w:r>
         <w:rPr/>
-        <w:t>Operational Risk Score (0-100 scale)</w:t>
+        <w:t>Operational risk score (0.0 to 98.9)</w:t>
       </w:r>
     </w:p>
     <w:p>
@@ -558,7 +558,7 @@
       </w:pPr>
       <w:r>
         <w:rPr/>
-        <w:t>2.3 Tools Used</w:t>
+        <w:t>2.3 Code</w:t>
       </w:r>
     </w:p>
     <w:p>
@@ -618,11 +618,11 @@
           <w:b/>
           <w:bCs/>
         </w:rPr>
-        <w:t xml:space="preserve">Statistical Analysis: </w:t>
-      </w:r>
-      <w:r>
-        <w:rPr/>
-        <w:t>VaR calculations, scenario modeling, probability distributions</w:t>
+        <w:t xml:space="preserve">SciPy: </w:t>
+      </w:r>
+      <w:r>
+        <w:rPr/>
+        <w:t>the Gaussian copula and the DeLong AUC interval</w:t>
       </w:r>
     </w:p>
     <w:p>
@@ -854,7 +854,7 @@
       </w:pPr>
       <w:r>
         <w:rPr/>
-        <w:t>The next two figures are percentiles of borrower net income per account. They were mislabeled as VaR in the February 2023 draft. A loss VaR cannot be smaller at 99% than at 95%.</w:t>
+        <w:t>The draft labeled two borrower-income percentiles as VaR. A loss VaR cannot be smaller at 99% than at 95%.</w:t>
       </w:r>
     </w:p>
     <w:p>
@@ -949,7 +949,7 @@
       </w:pPr>
       <w:r>
         <w:rPr/>
-        <w:t>Comprehensive stress testing reveals portfolio resilience under various adverse scenarios:</w:t>
+        <w:t>Revenue and expense shocks change aggregate borrower net income. They do not change PD or expected loss.</w:t>
       </w:r>
     </w:p>
     <w:tbl>
@@ -1441,54 +1441,11 @@
           <w:b/>
           <w:bCs/>
         </w:rPr>
-        <w:t xml:space="preserve">High-risk segments: </w:t>
+        <w:t xml:space="preserve">Above 60: </w:t>
       </w:r>
       <w:r>
         <w:rPr/>
         <w:t>Customers with operational risk above 60 default at 29.67% (27 of 91), versus 29.81% (271 of 909) for the rest</w:t>
-      </w:r>
-    </w:p>
-    <w:p>
-      <w:pPr>
-        <w:pStyle w:val="ListParagraph"/>
-        <w:numPr>
-          <w:ilvl w:val="0"/>
-          <w:numId w:val="1"/>
-        </w:numPr>
-        <w:rPr/>
-      </w:pPr>
-      <w:r>
-        <w:rPr>
-          <w:b/>
-          <w:bCs/>
-        </w:rPr>
-        <w:t xml:space="preserve">Process inefficiencies: </w:t>
-      </w:r>
-      <w:r>
-        <w:rPr/>
-        <w:t>This file does not show a higher default rate when the operational risk score is already high</w:t>
-      </w:r>
-    </w:p>
-    <w:p>
-      <w:pPr>
-        <w:pStyle w:val="ListParagraph"/>
-        <w:numPr>
-          <w:ilvl w:val="0"/>
-          <w:numId w:val="1"/>
-        </w:numPr>
-        <w:spacing w:before="0" w:after="240"/>
-        <w:rPr/>
-      </w:pPr>
-      <w:r>
-        <w:rPr>
-          <w:b/>
-          <w:bCs/>
-        </w:rPr>
-        <w:t xml:space="preserve">Monitoring gaps: </w:t>
-      </w:r>
-      <w:r>
-        <w:rPr/>
-        <w:t>Current systems lack real-time tracking of operational risk indicators</w:t>
       </w:r>
     </w:p>
     <w:p>
@@ -1573,7 +1530,7 @@
       </w:pPr>
       <w:r>
         <w:rPr/>
-        <w:t>4. Recommendations</w:t>
+        <w:t>4. Reading the results</w:t>
       </w:r>
     </w:p>
     <w:p>
@@ -1584,7 +1541,7 @@
       </w:pPr>
       <w:r>
         <w:rPr/>
-        <w:t>Based on the comprehensive risk analysis, the following strategic recommendations are proposed:</w:t>
+        <w:t>The notes below are judgment. This file does not measure their effect.</w:t>
       </w:r>
     </w:p>
     <w:p>
@@ -1601,7 +1558,7 @@
           <w:b/>
           <w:bCs/>
         </w:rPr>
-        <w:t>Credit Risk Mitigation</w:t>
+        <w:t>High-PD loans</w:t>
       </w:r>
     </w:p>
     <w:p>
@@ -1616,7 +1573,7 @@
       </w:r>
       <w:r>
         <w:rPr/>
-        <w:t>Implement stricter lending criteria for loans with PD &gt; 20%. Consider requiring additional collateral or higher interest rates for high-risk borrowers. Recommended actions include credit score threshold adjustments and enhanced underwriting processes.</w:t>
+        <w:t>Loans with PD above 20% are 50.4% of the count and 29.72% of EAD. A tighter screen on that band would be a policy choice. The file does not show what it would do to defaults.</w:t>
       </w:r>
     </w:p>
     <w:p>
@@ -1633,7 +1590,7 @@
           <w:b/>
           <w:bCs/>
         </w:rPr>
-        <w:t>Operational Risk Management</w:t>
+        <w:t>Operational risk</w:t>
       </w:r>
     </w:p>
     <w:p>
@@ -1648,7 +1605,7 @@
       </w:r>
       <w:r>
         <w:rPr/>
-        <w:t>Do not treat an operational risk score above 60 as a default screen on this book: that band's default rate matches the rest. Monitoring can still be an operational control.</w:t>
+        <w:t>An operational risk score above 60 is not a default screen on this book. That band defaults at the same rate as the rest (27 of 91).</w:t>
       </w:r>
     </w:p>
     <w:p>
@@ -1665,7 +1622,7 @@
           <w:b/>
           <w:bCs/>
         </w:rPr>
-        <w:t>Stress Test Preparedness</w:t>
+        <w:t>Credit loss and earnings</w:t>
       </w:r>
     </w:p>
     <w:p>
@@ -1697,7 +1654,7 @@
           <w:b/>
           <w:bCs/>
         </w:rPr>
-        <w:t>Portfolio Diversification</w:t>
+        <w:t>Concentration</w:t>
       </w:r>
     </w:p>
     <w:p>
@@ -1712,24 +1669,17 @@
       </w:r>
       <w:r>
         <w:rPr/>
-        <w:t>High-PD loans are 50.4% of count and 29.72% of EAD. Exposure concentration is the figure to manage. A 30% cap would be a policy choice, not a result from this file.</w:t>
-      </w:r>
-    </w:p>
-    <w:p>
-      <w:pPr>
-        <w:pStyle w:val="ListParagraph"/>
-        <w:numPr>
-          <w:ilvl w:val="0"/>
-          <w:numId w:val="2"/>
-        </w:numPr>
-        <w:rPr/>
-      </w:pPr>
-      <w:r>
-        <w:rPr>
-          <w:b/>
-          <w:bCs/>
-        </w:rPr>
-        <w:t>Monitoring &amp; Reporting Infrastructure</w:t>
+        <w:t>High-PD loans are 50.4% of count and 29.72% of EAD. The exposure share is the concentration figure. The file does not identify a cap.</w:t>
+      </w:r>
+    </w:p>
+    <w:p>
+      <w:pPr>
+        <w:pStyle w:val="Heading1"/>
+        <w:rPr/>
+      </w:pPr>
+      <w:r>
+        <w:rPr/>
+        <w:t>5. Conclusion</w:t>
       </w:r>
     </w:p>
     <w:p>
@@ -1740,92 +1690,35 @@
       </w:pPr>
       <w:r>
         <w:rPr/>
-        <w:t xml:space="preserve">   </w:t>
-      </w:r>
-      <w:r>
-        <w:rPr/>
-        <w:t>Deploy real-time dashboards tracking PD, VaR, and operational KPIs. Implement automated reporting systems with weekly executive summaries and monthly deep-dive analyses. Integrate predictive analytics for early warning signals.</w:t>
-      </w:r>
-    </w:p>
-    <w:p>
-      <w:pPr>
-        <w:pStyle w:val="ListParagraph"/>
-        <w:numPr>
-          <w:ilvl w:val="0"/>
-          <w:numId w:val="2"/>
-        </w:numPr>
-        <w:rPr/>
-      </w:pPr>
-      <w:r>
-        <w:rPr>
-          <w:b/>
-          <w:bCs/>
-        </w:rPr>
-        <w:t>Risk-Adjusted Pricing Strategy</w:t>
-      </w:r>
-    </w:p>
-    <w:p>
-      <w:pPr>
-        <w:pStyle w:val="Normal"/>
-        <w:spacing w:before="0" w:after="360"/>
-        <w:rPr/>
-      </w:pPr>
-      <w:r>
-        <w:rPr/>
-        <w:t xml:space="preserve">   </w:t>
-      </w:r>
-      <w:r>
-        <w:rPr/>
-        <w:t>Implement dynamic pricing models that adjust interest rates based on real-time PD calculations. Ensure that high-risk loans are priced to compensate for increased default probability. Target risk-adjusted returns of 12-15% across the portfolio.</w:t>
-      </w:r>
-    </w:p>
-    <w:p>
-      <w:pPr>
-        <w:pStyle w:val="Heading1"/>
-        <w:rPr/>
-      </w:pPr>
-      <w:r>
-        <w:rPr/>
-        <w:t>5. Conclusion</w:t>
-      </w:r>
-    </w:p>
-    <w:p>
-      <w:pPr>
-        <w:pStyle w:val="Normal"/>
-        <w:spacing w:before="0" w:after="180"/>
-        <w:rPr/>
-      </w:pPr>
-      <w:r>
-        <w:rPr/>
-        <w:t>This comprehensive risk assessment demonstrates advanced capabilities in quantifying financial and operational risks, simulating adverse scenarios, and proposing data-driven mitigation strategies. The analysis reveals:</w:t>
-      </w:r>
-    </w:p>
-    <w:p>
-      <w:pPr>
-        <w:pStyle w:val="ListParagraph"/>
-        <w:numPr>
-          <w:ilvl w:val="0"/>
-          <w:numId w:val="1"/>
-        </w:numPr>
-        <w:rPr/>
-      </w:pPr>
-      <w:r>
-        <w:rPr/>
-        <w:t>A portfolio with elevated credit risk, requiring immediate attention to high-PD segments</w:t>
-      </w:r>
-    </w:p>
-    <w:p>
-      <w:pPr>
-        <w:pStyle w:val="ListParagraph"/>
-        <w:numPr>
-          <w:ilvl w:val="0"/>
-          <w:numId w:val="1"/>
-        </w:numPr>
-        <w:rPr/>
-      </w:pPr>
-      <w:r>
-        <w:rPr/>
-        <w:t>Significant vulnerability to revenue shocks, particularly in combined stress scenarios</w:t>
+        <w:t>On this book:</w:t>
+      </w:r>
+    </w:p>
+    <w:p>
+      <w:pPr>
+        <w:pStyle w:val="ListParagraph"/>
+        <w:numPr>
+          <w:ilvl w:val="0"/>
+          <w:numId w:val="1"/>
+        </w:numPr>
+        <w:rPr/>
+      </w:pPr>
+      <w:r>
+        <w:rPr/>
+        <w:t>Unweighted mean PD is 29.80%. EAD-weighted PD is 17.23%, because higher-PD loans are smaller.</w:t>
+      </w:r>
+    </w:p>
+    <w:p>
+      <w:pPr>
+        <w:pStyle w:val="ListParagraph"/>
+        <w:numPr>
+          <w:ilvl w:val="0"/>
+          <w:numId w:val="1"/>
+        </w:numPr>
+        <w:rPr/>
+      </w:pPr>
+      <w:r>
+        <w:rPr/>
+        <w:t>Combined, aggregate borrower net income is -$12,559,240.00. That figure is not credit loss.</w:t>
       </w:r>
     </w:p>
     <w:p>
@@ -1840,21 +1733,6 @@
       <w:r>
         <w:rPr/>
         <w:t>Credit score, not operational risk, is the variable associated with default</w:t>
-      </w:r>
-    </w:p>
-    <w:p>
-      <w:pPr>
-        <w:pStyle w:val="ListParagraph"/>
-        <w:numPr>
-          <w:ilvl w:val="0"/>
-          <w:numId w:val="1"/>
-        </w:numPr>
-        <w:spacing w:before="0" w:after="240"/>
-        <w:rPr/>
-      </w:pPr>
-      <w:r>
-        <w:rPr/>
-        <w:t>Quantifiable risk metrics that can guide strategic decision-making</w:t>
       </w:r>
     </w:p>
     <w:p>
@@ -2103,11 +1981,11 @@
           <w:b/>
           <w:bCs/>
         </w:rPr>
-        <w:t xml:space="preserve">Logistic Regression: </w:t>
-      </w:r>
-      <w:r>
-        <w:rPr/>
-        <w:t>Widely used by financial institutions for binary classification and PD modeling</w:t>
+        <w:t xml:space="preserve">Scorecard: </w:t>
+      </w:r>
+      <w:r>
+        <w:rPr/>
+        <w:t>unpenalized logistic regression on credit score, loan amount, and operational risk. The published PD is the in-sample fit, not a holdout.</w:t>
       </w:r>
     </w:p>
     <w:p>
@@ -2149,7 +2027,7 @@
       </w:r>
       <w:r>
         <w:rPr/>
-        <w:t>borrower earnings shocks are separate from credit-loss shocks. This is not a CCAR submission.</w:t>
+        <w:t>borrower earnings shocks are separate from the credit-loss simulation.</w:t>
       </w:r>
     </w:p>
     <w:p>
@@ -2173,63 +2051,7 @@
           <w:b/>
           <w:bCs/>
         </w:rPr>
-        <w:t>Report prepared using Python (NumPy, Pandas, Scikit-learn, Matplotlib), demonstrating proficiency in:</w:t>
-      </w:r>
-    </w:p>
-    <w:p>
-      <w:pPr>
-        <w:pStyle w:val="ListParagraph"/>
-        <w:numPr>
-          <w:ilvl w:val="0"/>
-          <w:numId w:val="1"/>
-        </w:numPr>
-        <w:rPr/>
-      </w:pPr>
-      <w:r>
-        <w:rPr/>
-        <w:t>Statistical modeling and machine learning</w:t>
-      </w:r>
-    </w:p>
-    <w:p>
-      <w:pPr>
-        <w:pStyle w:val="ListParagraph"/>
-        <w:numPr>
-          <w:ilvl w:val="0"/>
-          <w:numId w:val="1"/>
-        </w:numPr>
-        <w:rPr/>
-      </w:pPr>
-      <w:r>
-        <w:rPr/>
-        <w:t>Data visualization and presentation</w:t>
-      </w:r>
-    </w:p>
-    <w:p>
-      <w:pPr>
-        <w:pStyle w:val="ListParagraph"/>
-        <w:numPr>
-          <w:ilvl w:val="0"/>
-          <w:numId w:val="1"/>
-        </w:numPr>
-        <w:rPr/>
-      </w:pPr>
-      <w:r>
-        <w:rPr/>
-        <w:t>Financial risk analysis and stress testing</w:t>
-      </w:r>
-    </w:p>
-    <w:p>
-      <w:pPr>
-        <w:pStyle w:val="ListParagraph"/>
-        <w:numPr>
-          <w:ilvl w:val="0"/>
-          <w:numId w:val="1"/>
-        </w:numPr>
-        <w:rPr/>
-      </w:pPr>
-      <w:r>
-        <w:rPr/>
-        <w:t>Quantitative research and reporting</w:t>
+        <w:t>Charts and the numerical note are written by the Python code in this repository.</w:t>
       </w:r>
     </w:p>
     <w:sectPr>

</xml_diff>